<commit_message>
Updated jenkins file and added word document
</commit_message>
<xml_diff>
--- a/Jenkins-CI-CD-flask-app.docx
+++ b/Jenkins-CI-CD-flask-app.docx
@@ -765,13 +765,13 @@
       </w:r>
     </w:p>
     <w:p>
-      <w:bookmarkStart w:id="0" w:name="_GoBack"/>
-      <w:bookmarkEnd w:id="0"/>
-      <w:proofErr w:type="spellStart"/>
+      <w:proofErr w:type="spellStart"/>
+      <w:proofErr w:type="gramStart"/>
       <w:r>
         <w:t>sudo</w:t>
       </w:r>
       <w:proofErr w:type="spellEnd"/>
+      <w:proofErr w:type="gramEnd"/>
       <w:r>
         <w:t xml:space="preserve"> apt install python3.12-venv</w:t>
       </w:r>
@@ -4485,6 +4485,68 @@
       </w:r>
     </w:p>
     <w:p/>
+    <w:p/>
+    <w:p>
+      <w:proofErr w:type="spellStart"/>
+      <w:proofErr w:type="gramStart"/>
+      <w:r>
+        <w:t>gsol</w:t>
+      </w:r>
+      <w:proofErr w:type="spellEnd"/>
+      <w:proofErr w:type="gramEnd"/>
+      <w:r>
+        <w:t xml:space="preserve"> </w:t>
+      </w:r>
+      <w:proofErr w:type="spellStart"/>
+      <w:r>
+        <w:t>ewkk</w:t>
+      </w:r>
+      <w:proofErr w:type="spellEnd"/>
+      <w:r>
+        <w:t xml:space="preserve"> </w:t>
+      </w:r>
+      <w:proofErr w:type="spellStart"/>
+      <w:r>
+        <w:t>ajyz</w:t>
+      </w:r>
+      <w:proofErr w:type="spellEnd"/>
+      <w:r>
+        <w:t xml:space="preserve"> </w:t>
+      </w:r>
+      <w:proofErr w:type="spellStart"/>
+      <w:r>
+        <w:t>kqyn</w:t>
+      </w:r>
+      <w:proofErr w:type="spellEnd"/>
+    </w:p>
+    <w:p>
+      <w:proofErr w:type="spellStart"/>
+      <w:r>
+        <w:t>lfne</w:t>
+      </w:r>
+      <w:proofErr w:type="spellEnd"/>
+      <w:r>
+        <w:t xml:space="preserve"> </w:t>
+      </w:r>
+      <w:proofErr w:type="spellStart"/>
+      <w:r>
+        <w:t>wayz</w:t>
+      </w:r>
+      <w:proofErr w:type="spellEnd"/>
+      <w:r>
+        <w:t xml:space="preserve"> </w:t>
+      </w:r>
+      <w:proofErr w:type="spellStart"/>
+      <w:r>
+        <w:t>qqaj</w:t>
+      </w:r>
+      <w:proofErr w:type="spellEnd"/>
+      <w:r>
+        <w:t xml:space="preserve"> iqps</w:t>
+      </w:r>
+      <w:bookmarkStart w:id="0" w:name="_GoBack"/>
+      <w:bookmarkEnd w:id="0"/>
+    </w:p>
     <w:sectPr>
       <w:pgSz w:w="11906" w:h="16838"/>
       <w:pgMar w:top="1440" w:right="1440" w:bottom="1440" w:left="1440" w:header="708" w:footer="708" w:gutter="0"/>

</xml_diff>